<commit_message>
docs: adjust project closure report to only contain Boris reflection
</commit_message>
<xml_diff>
--- a/docs/Projektschlussbericht_MeetPoint.docx
+++ b/docs/Projektschlussbericht_MeetPoint.docx
@@ -3911,258 +3911,6 @@
       <w:pPr/>
       <w:r>
         <w:t>Wichtigste Erkenntnisse: Eine detaillierte und sorgfältige Planung im Vorfeld (Meilensteine, Anforderungen, DB-Design) zahlt sich in der Umsetzungsphase doppelt aus, da sie bei unvorhersehbaren Problemen und Ausfällen als klarer Kompass dient.</w:t>
-      </w:r>
-    </w:p>
-    <w:p>
-      <w:pPr>
-        <w:pStyle w:val="berschrift2"/>
-      </w:pPr>
-      <w:r>
-        <w:t>Reflexion von Dmytro (Tech Lead / DB)</w:t>
-      </w:r>
-    </w:p>
-    <w:p>
-      <w:pPr>
-        <w:spacing w:before="240" w:after="80"/>
-      </w:pPr>
-      <w:r/>
-      <w:r>
-        <w:rPr>
-          <w:b/>
-          <w:sz w:val="26"/>
-        </w:rPr>
-        <w:t>Mein Beitrag zum Projekt</w:t>
-      </w:r>
-    </w:p>
-    <w:p>
-      <w:pPr/>
-      <w:r>
-        <w:t>Mein Beitrag zum Projekt lag in der technischen Konzeption, der Erstellung des relationalen Datenbankmodells in DBeaver sowie dem Docker-Compose-Setup für PostgreSQL und PostgREST. Ich definierte die notwendigen Fremdschlüsselbeziehungen und Datenbank-Trigger zur automatischen Aktualisierung der Zeitstempel.</w:t>
-      </w:r>
-    </w:p>
-    <w:p>
-      <w:pPr>
-        <w:spacing w:before="240" w:after="80"/>
-      </w:pPr>
-      <w:r/>
-      <w:r>
-        <w:rPr>
-          <w:b/>
-          <w:sz w:val="26"/>
-        </w:rPr>
-        <w:t>Was ist gut gelungen?</w:t>
-      </w:r>
-    </w:p>
-    <w:p>
-      <w:pPr/>
-      <w:r>
-        <w:t>Gut gelungen ist mir das Datenbankdesign. Durch die saubere Trennung von app- und api-Schemas und den Einsatz von PostgreSQL-RPCs konnten wir ein äusserst sicheres und robustes Backend aufbauen, ohne ein zeitaufwendiges, separates API-Backend in einer Programmiersprache wie JavaScript schreiben zu müssen.</w:t>
-      </w:r>
-    </w:p>
-    <w:p>
-      <w:pPr>
-        <w:spacing w:before="240" w:after="80"/>
-      </w:pPr>
-      <w:r/>
-      <w:r>
-        <w:rPr>
-          <w:b/>
-          <w:sz w:val="26"/>
-        </w:rPr>
-        <w:t>Was würde ich beim nächsten Mal anders machen?</w:t>
-      </w:r>
-    </w:p>
-    <w:p>
-      <w:pPr/>
-      <w:r>
-        <w:t>Beim nächsten Mal würde ich mich noch intensiver in die Frontend-Programmierung von Vue 3 einarbeiten, um bei Ausfällen im Team flexibler zwischen Backend und Frontend wechseln zu können. Auch das automatische Testen von Datenbank-Migrationen wäre eine sinnvolle Erweiterung.</w:t>
-      </w:r>
-    </w:p>
-    <w:p>
-      <w:pPr>
-        <w:spacing w:before="240" w:after="80"/>
-      </w:pPr>
-      <w:r/>
-      <w:r>
-        <w:rPr>
-          <w:b/>
-          <w:sz w:val="26"/>
-        </w:rPr>
-        <w:t>Wichtigste Erkenntnisse</w:t>
-      </w:r>
-    </w:p>
-    <w:p>
-      <w:pPr/>
-      <w:r>
-        <w:t>Wichtigste Erkenntnisse: Die Automatisierung der API-Generierung durch PostgREST ist ein enormer Produktivitätsbooster, setzt aber ein fehlerfreies und durchdachtes Datenbankmodell voraus.</w:t>
-      </w:r>
-    </w:p>
-    <w:p>
-      <w:pPr>
-        <w:pStyle w:val="berschrift2"/>
-      </w:pPr>
-      <w:r>
-        <w:t>Reflexion von Fabio (Stellvertretender Projektleiter &amp; Analyst)</w:t>
-      </w:r>
-    </w:p>
-    <w:p>
-      <w:pPr>
-        <w:spacing w:before="240" w:after="80"/>
-      </w:pPr>
-      <w:r/>
-      <w:r>
-        <w:rPr>
-          <w:b/>
-          <w:sz w:val="26"/>
-        </w:rPr>
-        <w:t>Mein Beitrag zum Projekt</w:t>
-      </w:r>
-    </w:p>
-    <w:p>
-      <w:pPr/>
-      <w:r>
-        <w:t>Ich habe mich im Projekt primär auf die konzeptionellen Vorarbeiten konzentriert. Mein Beitrag umfasste die Erstellung der Stakeholderanalyse, das Ausarbeiten des Bewertungsschemas für die Nutzwertanalyse zur Auswahl der passenden Tools sowie die Mitarbeit bei der Risikoanalyse.</w:t>
-      </w:r>
-    </w:p>
-    <w:p>
-      <w:pPr>
-        <w:spacing w:before="240" w:after="80"/>
-      </w:pPr>
-      <w:r/>
-      <w:r>
-        <w:rPr>
-          <w:b/>
-          <w:sz w:val="26"/>
-        </w:rPr>
-        <w:t>Was ist gut gelungen?</w:t>
-      </w:r>
-    </w:p>
-    <w:p>
-      <w:pPr/>
-      <w:r>
-        <w:t>Gut gelungen ist die Identifikation der Risiken und Stakeholder-Erwartungen. Das hat dem Team geholfen, Risiken wie technische Hürden bei PostgREST frühzeitig zu minimieren, indem wir in Woche 1 einen technischen Prototyp gebaut haben.</w:t>
-      </w:r>
-    </w:p>
-    <w:p>
-      <w:pPr>
-        <w:spacing w:before="240" w:after="80"/>
-      </w:pPr>
-      <w:r/>
-      <w:r>
-        <w:rPr>
-          <w:b/>
-          <w:sz w:val="26"/>
-        </w:rPr>
-        <w:t>Was würde ich beim nächsten Mal anders machen?</w:t>
-      </w:r>
-    </w:p>
-    <w:p>
-      <w:pPr/>
-      <w:r>
-        <w:t>Beim nächsten Mal würde ich versuchen, mich weniger auf die administrativen und konzeptionellen Aufgaben zu beschränken und aktiver bei der Programmierung mitzuwirken, um die Projektleitung bei unerwarteten Engpässen personell besser zu entlasten.</w:t>
-      </w:r>
-    </w:p>
-    <w:p>
-      <w:pPr>
-        <w:spacing w:before="240" w:after="80"/>
-      </w:pPr>
-      <w:r/>
-      <w:r>
-        <w:rPr>
-          <w:b/>
-          <w:sz w:val="26"/>
-        </w:rPr>
-        <w:t>Wichtigste Erkenntnisse</w:t>
-      </w:r>
-    </w:p>
-    <w:p>
-      <w:pPr/>
-      <w:r>
-        <w:t>Wichtigste Erkenntnisse: Risiken müssen nicht nur auf dem Papier analysiert werden; eine frühzeitige Auseinandersetzung mit der Technik (Prototyping) verhindert böse Überraschungen kurz vor dem Abgabetermin.</w:t>
-      </w:r>
-    </w:p>
-    <w:p>
-      <w:pPr>
-        <w:pStyle w:val="berschrift2"/>
-      </w:pPr>
-      <w:r>
-        <w:t>Reflexion von Noël (Qualitätssicherung &amp; Testleiter)</w:t>
-      </w:r>
-    </w:p>
-    <w:p>
-      <w:pPr>
-        <w:spacing w:before="240" w:after="80"/>
-      </w:pPr>
-      <w:r/>
-      <w:r>
-        <w:rPr>
-          <w:b/>
-          <w:sz w:val="26"/>
-        </w:rPr>
-        <w:t>Mein Beitrag zum Projekt</w:t>
-      </w:r>
-    </w:p>
-    <w:p>
-      <w:pPr/>
-      <w:r>
-        <w:t>Als Testleiter war ich für die Qualitätssicherung zuständig. Mein Beitrag umfasste die Erstellung des Testkonzepts auf Basis unserer Anforderungsspezifikation, die Durchführung der manuellen End-to-End-Tests im Browser und die Dokumentation aller Ergebnisse im Testprotokoll.</w:t>
-      </w:r>
-    </w:p>
-    <w:p>
-      <w:pPr>
-        <w:spacing w:before="240" w:after="80"/>
-      </w:pPr>
-      <w:r/>
-      <w:r>
-        <w:rPr>
-          <w:b/>
-          <w:sz w:val="26"/>
-        </w:rPr>
-        <w:t>Was ist gut gelungen?</w:t>
-      </w:r>
-    </w:p>
-    <w:p>
-      <w:pPr/>
-      <w:r>
-        <w:t>Gut gelungen ist das strukturierte Vorgehen bei den Tests. Dadurch konnte ich kritische Fehler – wie die fehlerhafte Gruppensichtbarkeit für Nicht-Besitzer – vor der finalen Abgabe identifizieren und an das Team zur Behebung zurückmelden.</w:t>
-      </w:r>
-    </w:p>
-    <w:p>
-      <w:pPr>
-        <w:spacing w:before="240" w:after="80"/>
-      </w:pPr>
-      <w:r/>
-      <w:r>
-        <w:rPr>
-          <w:b/>
-          <w:sz w:val="26"/>
-        </w:rPr>
-        <w:t>Was würde ich beim nächsten Mal anders machen?</w:t>
-      </w:r>
-    </w:p>
-    <w:p>
-      <w:pPr/>
-      <w:r>
-        <w:t>Beim nächsten Mal würde ich gerne automatisierte Komponententests in Vue (z.B. mit Vitest) implementieren. Manuelle End-to-End-Tests im Browser sind zwar sehr effektiv, nehmen aber mit zunehmender Projektgrösse zu viel Zeit in Anspruch.</w:t>
-      </w:r>
-    </w:p>
-    <w:p>
-      <w:pPr>
-        <w:spacing w:before="240" w:after="80"/>
-      </w:pPr>
-      <w:r/>
-      <w:r>
-        <w:rPr>
-          <w:b/>
-          <w:sz w:val="26"/>
-        </w:rPr>
-        <w:t>Wichtigste Erkenntnisse</w:t>
-      </w:r>
-    </w:p>
-    <w:p>
-      <w:pPr/>
-      <w:r>
-        <w:t>Wichtigste Erkenntnisse: Qualitätssicherung ist keine einmalige Aufgabe am Projektende, sondern muss kontinuierlich und begleitend zur Entwicklung stattfinden.</w:t>
       </w:r>
     </w:p>
     <w:p>

</xml_diff>

<commit_message>
docs: add completed Projektschlussbericht with replaced metadata placeholders
</commit_message>
<xml_diff>
--- a/docs/Projektschlussbericht_MeetPoint.docx
+++ b/docs/Projektschlussbericht_MeetPoint.docx
@@ -143,7 +143,7 @@
                                         <w:szCs w:val="40"/>
                                         <w:lang w:val="de-DE"/>
                                       </w:rPr>
-                                      <w:t>[Datum]</w:t>
+                                      <w:t>22. Juni 2026</w:t>
                                     </w:r>
                                   </w:p>
                                 </w:sdtContent>
@@ -217,7 +217,7 @@
                                   <w:szCs w:val="40"/>
                                   <w:lang w:val="de-DE"/>
                                 </w:rPr>
-                                <w:t>[Datum]</w:t>
+                                <w:t>22. Juni 2026</w:t>
                               </w:r>
                             </w:p>
                           </w:sdtContent>
@@ -336,7 +336,7 @@
                                         <w:sz w:val="28"/>
                                         <w:szCs w:val="28"/>
                                       </w:rPr>
-                                      <w:t>JeNi</w:t>
+                                      <w:t>Boris</w:t>
                                     </w:r>
                                   </w:p>
                                 </w:sdtContent>
@@ -399,7 +399,7 @@
                                   <w:sz w:val="28"/>
                                   <w:szCs w:val="28"/>
                                 </w:rPr>
-                                <w:t>JeNi</w:t>
+                                <w:t>Boris</w:t>
                               </w:r>
                             </w:p>
                           </w:sdtContent>
@@ -520,7 +520,7 @@
                                         <w:sz w:val="56"/>
                                         <w:szCs w:val="56"/>
                                       </w:rPr>
-                                      <w:t>Projektschlussbericht</w:t>
+                                      <w:t>Projektschlussbericht – MeetPoint</w:t>
                                     </w:r>
                                   </w:sdtContent>
                                 </w:sdt>
@@ -606,7 +606,7 @@
                                   <w:sz w:val="56"/>
                                   <w:szCs w:val="56"/>
                                 </w:rPr>
-                                <w:t>Projektschlussbericht</w:t>
+                                <w:t>Projektschlussbericht – MeetPoint</w:t>
                               </w:r>
                             </w:sdtContent>
                           </w:sdt>
@@ -3641,7 +3641,7 @@
                     <pic:cNvPicPr/>
                   </pic:nvPicPr>
                   <pic:blipFill>
-                    <a:blip r:embed="rId15"/>
+                    <a:blip r:embed="rId19"/>
                     <a:stretch>
                       <a:fillRect/>
                     </a:stretch>
@@ -3694,7 +3694,7 @@
                     <pic:cNvPicPr/>
                   </pic:nvPicPr>
                   <pic:blipFill>
-                    <a:blip r:embed="rId16"/>
+                    <a:blip r:embed="rId20"/>
                     <a:stretch>
                       <a:fillRect/>
                     </a:stretch>
@@ -3747,7 +3747,7 @@
                     <pic:cNvPicPr/>
                   </pic:nvPicPr>
                   <pic:blipFill>
-                    <a:blip r:embed="rId17"/>
+                    <a:blip r:embed="rId21"/>
                     <a:stretch>
                       <a:fillRect/>
                     </a:stretch>
@@ -4139,6 +4139,10 @@
     <w:sectPr>
       <w:headerReference w:type="default" r:id="rId11"/>
       <w:footerReference w:type="default" r:id="rId12"/>
+      <w:headerReference w:type="first" r:id="rId15"/>
+      <w:footerReference w:type="first" r:id="rId16"/>
+      <w:headerReference w:type="even" r:id="rId17"/>
+      <w:footerReference w:type="even" r:id="rId18"/>
       <w:pgSz w:w="11906" w:h="16838"/>
       <w:pgMar w:top="1417" w:right="1417" w:bottom="1134" w:left="1417" w:header="708" w:footer="708" w:gutter="0"/>
       <w:pgNumType w:start="0"/>
@@ -4251,7 +4255,7 @@
               <w:sz w:val="16"/>
               <w:szCs w:val="16"/>
             </w:rPr>
-            <w:t>Dokument47</w:t>
+            <w:t>Projektschlussbericht MeetPoint</w:t>
           </w:r>
           <w:r>
             <w:rPr>
@@ -4392,6 +4396,26 @@
 </w:ftr>
 </file>
 
+<file path=word/footer2.xml><?xml version="1.0" encoding="utf-8"?>
+<w:ftr xmlns:m="http://schemas.openxmlformats.org/officeDocument/2006/math" xmlns:mc="http://schemas.openxmlformats.org/markup-compatibility/2006" xmlns:mo="http://schemas.microsoft.com/office/mac/office/2008/main" xmlns:mv="urn:schemas-microsoft-com:mac:vml" xmlns:o="urn:schemas-microsoft-com:office:office" xmlns:r="http://schemas.openxmlformats.org/officeDocument/2006/relationships" xmlns:v="urn:schemas-microsoft-com:vml" xmlns:w10="urn:schemas-microsoft-com:office:word" xmlns:w14="http://schemas.microsoft.com/office/word/2010/wordml" xmlns:w="http://schemas.openxmlformats.org/wordprocessingml/2006/main" xmlns:wne="http://schemas.microsoft.com/office/word/2006/wordml" xmlns:wp14="http://schemas.microsoft.com/office/word/2010/wordprocessingDrawing" xmlns:wp="http://schemas.openxmlformats.org/drawingml/2006/wordprocessingDrawing" xmlns:wpc="http://schemas.microsoft.com/office/word/2010/wordprocessingCanvas" xmlns:wpg="http://schemas.microsoft.com/office/word/2010/wordprocessingGroup" xmlns:wpi="http://schemas.microsoft.com/office/word/2010/wordprocessingInk" xmlns:wps="http://schemas.microsoft.com/office/word/2010/wordprocessingShape" mc:Ignorable="w14 wp14">
+  <w:p>
+    <w:pPr>
+      <w:pStyle w:val="Footer"/>
+    </w:pPr>
+  </w:p>
+</w:ftr>
+</file>
+
+<file path=word/footer3.xml><?xml version="1.0" encoding="utf-8"?>
+<w:ftr xmlns:m="http://schemas.openxmlformats.org/officeDocument/2006/math" xmlns:mc="http://schemas.openxmlformats.org/markup-compatibility/2006" xmlns:mo="http://schemas.microsoft.com/office/mac/office/2008/main" xmlns:mv="urn:schemas-microsoft-com:mac:vml" xmlns:o="urn:schemas-microsoft-com:office:office" xmlns:r="http://schemas.openxmlformats.org/officeDocument/2006/relationships" xmlns:v="urn:schemas-microsoft-com:vml" xmlns:w10="urn:schemas-microsoft-com:office:word" xmlns:w14="http://schemas.microsoft.com/office/word/2010/wordml" xmlns:w="http://schemas.openxmlformats.org/wordprocessingml/2006/main" xmlns:wne="http://schemas.microsoft.com/office/word/2006/wordml" xmlns:wp14="http://schemas.microsoft.com/office/word/2010/wordprocessingDrawing" xmlns:wp="http://schemas.openxmlformats.org/drawingml/2006/wordprocessingDrawing" xmlns:wpc="http://schemas.microsoft.com/office/word/2010/wordprocessingCanvas" xmlns:wpg="http://schemas.microsoft.com/office/word/2010/wordprocessingGroup" xmlns:wpi="http://schemas.microsoft.com/office/word/2010/wordprocessingInk" xmlns:wps="http://schemas.microsoft.com/office/word/2010/wordprocessingShape" mc:Ignorable="w14 wp14">
+  <w:p>
+    <w:pPr>
+      <w:pStyle w:val="Footer"/>
+    </w:pPr>
+  </w:p>
+</w:ftr>
+</file>
+
 <file path=word/footnotes.xml><?xml version="1.0" encoding="utf-8"?>
 <w:footnotes xmlns:wpc="http://schemas.microsoft.com/office/word/2010/wordprocessingCanvas" xmlns:cx="http://schemas.microsoft.com/office/drawing/2014/chartex" xmlns:cx1="http://schemas.microsoft.com/office/drawing/2015/9/8/chartex" xmlns:cx2="http://schemas.microsoft.com/office/drawing/2015/10/21/chartex" xmlns:cx3="http://schemas.microsoft.com/office/drawing/2016/5/9/chartex" xmlns:cx4="http://schemas.microsoft.com/office/drawing/2016/5/10/chartex" xmlns:cx5="http://schemas.microsoft.com/office/drawing/2016/5/11/chartex" xmlns:cx6="http://schemas.microsoft.com/office/drawing/2016/5/12/chartex" xmlns:cx7="http://schemas.microsoft.com/office/drawing/2016/5/13/chartex" xmlns:cx8="http://schemas.microsoft.com/office/drawing/2016/5/14/chartex" xmlns:mc="http://schemas.openxmlformats.org/markup-compatibility/2006" xmlns:aink="http://schemas.microsoft.com/office/drawing/2016/ink" xmlns:am3d="http://schemas.microsoft.com/office/drawing/2017/model3d" xmlns:o="urn:schemas-microsoft-com:office:office" xmlns:oel="http://schemas.microsoft.com/office/2019/extlst" xmlns:r="http://schemas.openxmlformats.org/officeDocument/2006/relationships" xmlns:m="http://schemas.openxmlformats.org/officeDocument/2006/math" xmlns:v="urn:schemas-microsoft-com:vml" xmlns:wp14="http://schemas.microsoft.com/office/word/2010/wordprocessingDrawing" xmlns:wp="http://schemas.openxmlformats.org/drawingml/2006/wordprocessingDrawing" xmlns:w10="urn:schemas-microsoft-com:office:word" xmlns:w="http://schemas.openxmlformats.org/wordprocessingml/2006/main" xmlns:w14="http://schemas.microsoft.com/office/word/2010/wordml" xmlns:w15="http://schemas.microsoft.com/office/word/2012/wordml" xmlns:w16cex="http://schemas.microsoft.com/office/word/2018/wordml/cex" xmlns:w16cid="http://schemas.microsoft.com/office/word/2016/wordml/cid" xmlns:w16="http://schemas.microsoft.com/office/word/2018/wordml" xmlns:w16du="http://schemas.microsoft.com/office/word/2023/wordml/word16du" xmlns:w16sdtdh="http://schemas.microsoft.com/office/word/2020/wordml/sdtdatahash" xmlns:w16sdtfl="http://schemas.microsoft.com/office/word/2024/wordml/sdtformatlock" xmlns:w16se="http://schemas.microsoft.com/office/word/2015/wordml/symex" xmlns:wpg="http://schemas.microsoft.com/office/word/2010/wordprocessingGroup" xmlns:wpi="http://schemas.microsoft.com/office/word/2010/wordprocessingInk" xmlns:wne="http://schemas.microsoft.com/office/word/2006/wordml" xmlns:wps="http://schemas.microsoft.com/office/word/2010/wordprocessingShape" mc:Ignorable="w14 w15 w16se w16cid w16 w16cex w16sdtdh w16sdtfl w16du wp14">
   <w:footnote w:type="separator" w:id="-1">
@@ -4457,7 +4481,7 @@
               <w:sz w:val="16"/>
               <w:szCs w:val="16"/>
             </w:rPr>
-            <w:t>Projektbezeichnung</w:t>
+            <w:t>MeetPoint</w:t>
           </w:r>
         </w:p>
       </w:tc>
@@ -4481,7 +4505,7 @@
               <w:sz w:val="16"/>
               <w:szCs w:val="16"/>
             </w:rPr>
-            <w:t>Nachname 1, Nachname 2, Nachname 3, Nachname 4, Nachname 5</w:t>
+            <w:t>Boris, Fabio, Dmytro, Noël</w:t>
           </w:r>
         </w:p>
       </w:tc>
@@ -4495,6 +4519,26 @@
         <w:sz w:val="16"/>
         <w:szCs w:val="16"/>
       </w:rPr>
+    </w:pPr>
+  </w:p>
+</w:hdr>
+</file>
+
+<file path=word/header2.xml><?xml version="1.0" encoding="utf-8"?>
+<w:hdr xmlns:m="http://schemas.openxmlformats.org/officeDocument/2006/math" xmlns:mc="http://schemas.openxmlformats.org/markup-compatibility/2006" xmlns:mo="http://schemas.microsoft.com/office/mac/office/2008/main" xmlns:mv="urn:schemas-microsoft-com:mac:vml" xmlns:o="urn:schemas-microsoft-com:office:office" xmlns:r="http://schemas.openxmlformats.org/officeDocument/2006/relationships" xmlns:v="urn:schemas-microsoft-com:vml" xmlns:w10="urn:schemas-microsoft-com:office:word" xmlns:w14="http://schemas.microsoft.com/office/word/2010/wordml" xmlns:w="http://schemas.openxmlformats.org/wordprocessingml/2006/main" xmlns:wne="http://schemas.microsoft.com/office/word/2006/wordml" xmlns:wp14="http://schemas.microsoft.com/office/word/2010/wordprocessingDrawing" xmlns:wp="http://schemas.openxmlformats.org/drawingml/2006/wordprocessingDrawing" xmlns:wpc="http://schemas.microsoft.com/office/word/2010/wordprocessingCanvas" xmlns:wpg="http://schemas.microsoft.com/office/word/2010/wordprocessingGroup" xmlns:wpi="http://schemas.microsoft.com/office/word/2010/wordprocessingInk" xmlns:wps="http://schemas.microsoft.com/office/word/2010/wordprocessingShape" mc:Ignorable="w14 wp14">
+  <w:p>
+    <w:pPr>
+      <w:pStyle w:val="Header"/>
+    </w:pPr>
+  </w:p>
+</w:hdr>
+</file>
+
+<file path=word/header3.xml><?xml version="1.0" encoding="utf-8"?>
+<w:hdr xmlns:m="http://schemas.openxmlformats.org/officeDocument/2006/math" xmlns:mc="http://schemas.openxmlformats.org/markup-compatibility/2006" xmlns:mo="http://schemas.microsoft.com/office/mac/office/2008/main" xmlns:mv="urn:schemas-microsoft-com:mac:vml" xmlns:o="urn:schemas-microsoft-com:office:office" xmlns:r="http://schemas.openxmlformats.org/officeDocument/2006/relationships" xmlns:v="urn:schemas-microsoft-com:vml" xmlns:w10="urn:schemas-microsoft-com:office:word" xmlns:w14="http://schemas.microsoft.com/office/word/2010/wordml" xmlns:w="http://schemas.openxmlformats.org/wordprocessingml/2006/main" xmlns:wne="http://schemas.microsoft.com/office/word/2006/wordml" xmlns:wp14="http://schemas.microsoft.com/office/word/2010/wordprocessingDrawing" xmlns:wp="http://schemas.openxmlformats.org/drawingml/2006/wordprocessingDrawing" xmlns:wpc="http://schemas.microsoft.com/office/word/2010/wordprocessingCanvas" xmlns:wpg="http://schemas.microsoft.com/office/word/2010/wordprocessingGroup" xmlns:wpi="http://schemas.microsoft.com/office/word/2010/wordprocessingInk" xmlns:wps="http://schemas.microsoft.com/office/word/2010/wordprocessingShape" mc:Ignorable="w14 wp14">
+  <w:p>
+    <w:pPr>
+      <w:pStyle w:val="Header"/>
     </w:pPr>
   </w:p>
 </w:hdr>

</xml_diff>